<commit_message>
service: finalise 21 Jun chord doc (God Is For Us + Sovereign in E)
- all 5 songs resolved: God Is For Us = CityAlight (was mis-titled); Sovereign transposed D->E per Eric's preference
- remove service-leading/2026-06-21/ — canonical home is the Obsidian system (1-Faith/8-Service-Leading/outputs/)

Co-Authored-By: Claude Opus 4.8 (1M context) <noreply@anthropic.com>
</commit_message>
<xml_diff>
--- a/service-builder/output/21 June 2026.docx
+++ b/service-builder/output/21 June 2026.docx
@@ -75,7 +75,7 @@
         <w:rPr>
           <w:b w:val="0"/>
         </w:rPr>
-        <w:t>Our God is for us — confirm exact song &amp; add to library (likely Chris Tomlin, “Our God”)</w:t>
+        <w:t>God Is For Us - CityAlight — who can stand against us</w:t>
       </w:r>
     </w:p>
     <w:p>
@@ -119,7 +119,7 @@
         <w:rPr>
           <w:b w:val="0"/>
         </w:rPr>
-        <w:t>Sovereign - Chris Tomlin — with me in the storm</w:t>
+        <w:t>Sovereign - Chris Tomlin (E) — with me in the storm</w:t>
       </w:r>
     </w:p>
     <w:p>
@@ -792,6 +792,765 @@
         <w:rPr>
           <w:b/>
         </w:rPr>
+        <w:t>God Is For Us (D)</w:t>
+      </w:r>
+    </w:p>
+    <w:p>
+      <w:pPr>
+        <w:spacing w:before="0" w:after="0" w:line="240" w:lineRule="auto"/>
+      </w:pPr>
+      <w:r>
+        <w:rPr>
+          <w:b w:val="0"/>
+        </w:rPr>
+        <w:t>[Intro]</w:t>
+      </w:r>
+    </w:p>
+    <w:p>
+      <w:pPr>
+        <w:spacing w:before="0" w:after="0" w:line="240" w:lineRule="auto"/>
+      </w:pPr>
+      <w:r>
+        <w:rPr>
+          <w:b w:val="0"/>
+        </w:rPr>
+        <w:t>|D / / /|G / / /|</w:t>
+      </w:r>
+    </w:p>
+    <w:p>
+      <w:pPr>
+        <w:spacing w:before="0" w:after="0" w:line="240" w:lineRule="auto"/>
+      </w:pPr>
+      <w:r>
+        <w:rPr>
+          <w:b w:val="0"/>
+        </w:rPr>
+        <w:t>|D / / /|G / / /|</w:t>
+      </w:r>
+    </w:p>
+    <w:p>
+      <w:pPr>
+        <w:spacing w:before="0" w:after="0" w:line="240" w:lineRule="auto"/>
+      </w:pPr>
+      <w:r>
+        <w:rPr>
+          <w:b w:val="0"/>
+        </w:rPr>
+      </w:r>
+    </w:p>
+    <w:p>
+      <w:pPr>
+        <w:spacing w:before="0" w:after="0" w:line="240" w:lineRule="auto"/>
+      </w:pPr>
+      <w:r>
+        <w:rPr>
+          <w:b w:val="0"/>
+        </w:rPr>
+        <w:t>[Verse 1]</w:t>
+      </w:r>
+    </w:p>
+    <w:p>
+      <w:pPr>
+        <w:spacing w:before="0" w:after="0" w:line="240" w:lineRule="auto"/>
+      </w:pPr>
+      <w:r>
+        <w:rPr>
+          <w:b w:val="0"/>
+        </w:rPr>
+        <w:t>D                                     G                        D</w:t>
+      </w:r>
+    </w:p>
+    <w:p>
+      <w:pPr>
+        <w:spacing w:before="0" w:after="0" w:line="240" w:lineRule="auto"/>
+      </w:pPr>
+      <w:r>
+        <w:rPr>
+          <w:b w:val="0"/>
+        </w:rPr>
+        <w:t>We won't fear the battle, we won't fear the night</w:t>
+      </w:r>
+    </w:p>
+    <w:p>
+      <w:pPr>
+        <w:spacing w:before="0" w:after="0" w:line="240" w:lineRule="auto"/>
+      </w:pPr>
+      <w:r>
+        <w:rPr>
+          <w:b w:val="0"/>
+        </w:rPr>
+        <w:t>G                        D        Bm                    A</w:t>
+      </w:r>
+    </w:p>
+    <w:p>
+      <w:pPr>
+        <w:spacing w:before="0" w:after="0" w:line="240" w:lineRule="auto"/>
+      </w:pPr>
+      <w:r>
+        <w:rPr>
+          <w:b w:val="0"/>
+        </w:rPr>
+        <w:t>We will walk the valley with You by our side</w:t>
+      </w:r>
+    </w:p>
+    <w:p>
+      <w:pPr>
+        <w:spacing w:before="0" w:after="0" w:line="240" w:lineRule="auto"/>
+      </w:pPr>
+      <w:r>
+        <w:rPr>
+          <w:b w:val="0"/>
+        </w:rPr>
+        <w:t>D                                G                         D</w:t>
+      </w:r>
+    </w:p>
+    <w:p>
+      <w:pPr>
+        <w:spacing w:before="0" w:after="0" w:line="240" w:lineRule="auto"/>
+      </w:pPr>
+      <w:r>
+        <w:rPr>
+          <w:b w:val="0"/>
+        </w:rPr>
+        <w:t>You will go before us, You will lead the way</w:t>
+      </w:r>
+    </w:p>
+    <w:p>
+      <w:pPr>
+        <w:spacing w:before="0" w:after="0" w:line="240" w:lineRule="auto"/>
+      </w:pPr>
+      <w:r>
+        <w:rPr>
+          <w:b w:val="0"/>
+        </w:rPr>
+        <w:t>G                         D          Bm                A</w:t>
+      </w:r>
+    </w:p>
+    <w:p>
+      <w:pPr>
+        <w:spacing w:before="0" w:after="0" w:line="240" w:lineRule="auto"/>
+      </w:pPr>
+      <w:r>
+        <w:rPr>
+          <w:b w:val="0"/>
+        </w:rPr>
+        <w:t>We have found a refuge, only You can save</w:t>
+      </w:r>
+    </w:p>
+    <w:p>
+      <w:pPr>
+        <w:spacing w:before="0" w:after="0" w:line="240" w:lineRule="auto"/>
+      </w:pPr>
+      <w:r>
+        <w:rPr>
+          <w:b w:val="0"/>
+        </w:rPr>
+      </w:r>
+    </w:p>
+    <w:p>
+      <w:pPr>
+        <w:spacing w:before="0" w:after="0" w:line="240" w:lineRule="auto"/>
+      </w:pPr>
+      <w:r>
+        <w:rPr>
+          <w:b w:val="0"/>
+        </w:rPr>
+        <w:t>[Chorus]</w:t>
+      </w:r>
+    </w:p>
+    <w:p>
+      <w:pPr>
+        <w:spacing w:before="0" w:after="0" w:line="240" w:lineRule="auto"/>
+      </w:pPr>
+      <w:r>
+        <w:rPr>
+          <w:b w:val="0"/>
+        </w:rPr>
+        <w:t>D                          G                D</w:t>
+      </w:r>
+    </w:p>
+    <w:p>
+      <w:pPr>
+        <w:spacing w:before="0" w:after="0" w:line="240" w:lineRule="auto"/>
+      </w:pPr>
+      <w:r>
+        <w:rPr>
+          <w:b w:val="0"/>
+        </w:rPr>
+        <w:t>Sing with joy now: our God is for us</w:t>
+      </w:r>
+    </w:p>
+    <w:p>
+      <w:pPr>
+        <w:spacing w:before="0" w:after="0" w:line="240" w:lineRule="auto"/>
+      </w:pPr>
+      <w:r>
+        <w:rPr>
+          <w:b w:val="0"/>
+        </w:rPr>
+        <w:t>G                      D         Bm                      A</w:t>
+      </w:r>
+    </w:p>
+    <w:p>
+      <w:pPr>
+        <w:spacing w:before="0" w:after="0" w:line="240" w:lineRule="auto"/>
+      </w:pPr>
+      <w:r>
+        <w:rPr>
+          <w:b w:val="0"/>
+        </w:rPr>
+        <w:t>The Father's love is a strong and mighty fortress</w:t>
+      </w:r>
+    </w:p>
+    <w:p>
+      <w:pPr>
+        <w:spacing w:before="0" w:after="0" w:line="240" w:lineRule="auto"/>
+      </w:pPr>
+      <w:r>
+        <w:rPr>
+          <w:b w:val="0"/>
+        </w:rPr>
+        <w:t>D                                 G                D</w:t>
+      </w:r>
+    </w:p>
+    <w:p>
+      <w:pPr>
+        <w:spacing w:before="0" w:after="0" w:line="240" w:lineRule="auto"/>
+      </w:pPr>
+      <w:r>
+        <w:rPr>
+          <w:b w:val="0"/>
+        </w:rPr>
+        <w:t>Raise your voice now, no love is greater</w:t>
+      </w:r>
+    </w:p>
+    <w:p>
+      <w:pPr>
+        <w:spacing w:before="0" w:after="0" w:line="240" w:lineRule="auto"/>
+      </w:pPr>
+      <w:r>
+        <w:rPr>
+          <w:b w:val="0"/>
+        </w:rPr>
+        <w:t>G                      D                          A</w:t>
+      </w:r>
+    </w:p>
+    <w:p>
+      <w:pPr>
+        <w:spacing w:before="0" w:after="0" w:line="240" w:lineRule="auto"/>
+      </w:pPr>
+      <w:r>
+        <w:rPr>
+          <w:b w:val="0"/>
+        </w:rPr>
+        <w:t>Who can stand against us if our God is for us</w:t>
+      </w:r>
+    </w:p>
+    <w:p>
+      <w:pPr>
+        <w:spacing w:before="0" w:after="0" w:line="240" w:lineRule="auto"/>
+      </w:pPr>
+      <w:r>
+        <w:rPr>
+          <w:b w:val="0"/>
+        </w:rPr>
+      </w:r>
+    </w:p>
+    <w:p>
+      <w:pPr>
+        <w:spacing w:before="0" w:after="0" w:line="240" w:lineRule="auto"/>
+      </w:pPr>
+      <w:r>
+        <w:rPr>
+          <w:b w:val="0"/>
+        </w:rPr>
+        <w:t>**INTRO**</w:t>
+      </w:r>
+    </w:p>
+    <w:p>
+      <w:pPr>
+        <w:spacing w:before="0" w:after="0" w:line="240" w:lineRule="auto"/>
+      </w:pPr>
+      <w:r>
+        <w:rPr>
+          <w:b w:val="0"/>
+        </w:rPr>
+      </w:r>
+    </w:p>
+    <w:p>
+      <w:pPr>
+        <w:spacing w:before="0" w:after="0" w:line="240" w:lineRule="auto"/>
+      </w:pPr>
+      <w:r>
+        <w:rPr>
+          <w:b w:val="0"/>
+        </w:rPr>
+        <w:t>[Verse 2]</w:t>
+      </w:r>
+    </w:p>
+    <w:p>
+      <w:pPr>
+        <w:spacing w:before="0" w:after="0" w:line="240" w:lineRule="auto"/>
+      </w:pPr>
+      <w:r>
+        <w:rPr>
+          <w:b w:val="0"/>
+        </w:rPr>
+        <w:t>D                                 G                  D</w:t>
+      </w:r>
+    </w:p>
+    <w:p>
+      <w:pPr>
+        <w:spacing w:before="0" w:after="0" w:line="240" w:lineRule="auto"/>
+      </w:pPr>
+      <w:r>
+        <w:rPr>
+          <w:b w:val="0"/>
+        </w:rPr>
+        <w:t>Even when I stumble, even when I fall</w:t>
+      </w:r>
+    </w:p>
+    <w:p>
+      <w:pPr>
+        <w:spacing w:before="0" w:after="0" w:line="240" w:lineRule="auto"/>
+      </w:pPr>
+      <w:r>
+        <w:rPr>
+          <w:b w:val="0"/>
+        </w:rPr>
+        <w:t>G                   D              Bm                      A</w:t>
+      </w:r>
+    </w:p>
+    <w:p>
+      <w:pPr>
+        <w:spacing w:before="0" w:after="0" w:line="240" w:lineRule="auto"/>
+      </w:pPr>
+      <w:r>
+        <w:rPr>
+          <w:b w:val="0"/>
+        </w:rPr>
+        <w:t>Even when I turn back, still Your love is sure</w:t>
+      </w:r>
+    </w:p>
+    <w:p>
+      <w:pPr>
+        <w:spacing w:before="0" w:after="0" w:line="240" w:lineRule="auto"/>
+      </w:pPr>
+      <w:r>
+        <w:rPr>
+          <w:b w:val="0"/>
+        </w:rPr>
+        <w:t>D                                G                    D</w:t>
+      </w:r>
+    </w:p>
+    <w:p>
+      <w:pPr>
+        <w:spacing w:before="0" w:after="0" w:line="240" w:lineRule="auto"/>
+      </w:pPr>
+      <w:r>
+        <w:rPr>
+          <w:b w:val="0"/>
+        </w:rPr>
+        <w:t>You will not abandon, You will not forsake</w:t>
+      </w:r>
+    </w:p>
+    <w:p>
+      <w:pPr>
+        <w:spacing w:before="0" w:after="0" w:line="240" w:lineRule="auto"/>
+      </w:pPr>
+      <w:r>
+        <w:rPr>
+          <w:b w:val="0"/>
+        </w:rPr>
+        <w:t>G                           D                 Bm             A</w:t>
+      </w:r>
+    </w:p>
+    <w:p>
+      <w:pPr>
+        <w:spacing w:before="0" w:after="0" w:line="240" w:lineRule="auto"/>
+      </w:pPr>
+      <w:r>
+        <w:rPr>
+          <w:b w:val="0"/>
+        </w:rPr>
+        <w:t>You will cheer me onward with never-ending grace</w:t>
+      </w:r>
+    </w:p>
+    <w:p>
+      <w:pPr>
+        <w:spacing w:before="0" w:after="0" w:line="240" w:lineRule="auto"/>
+      </w:pPr>
+      <w:r>
+        <w:rPr>
+          <w:b w:val="0"/>
+        </w:rPr>
+      </w:r>
+    </w:p>
+    <w:p>
+      <w:pPr>
+        <w:spacing w:before="0" w:after="0" w:line="240" w:lineRule="auto"/>
+      </w:pPr>
+      <w:r>
+        <w:rPr>
+          <w:b w:val="0"/>
+        </w:rPr>
+        <w:t>**CHORUS**</w:t>
+      </w:r>
+    </w:p>
+    <w:p>
+      <w:pPr>
+        <w:spacing w:before="0" w:after="0" w:line="240" w:lineRule="auto"/>
+      </w:pPr>
+      <w:r>
+        <w:rPr>
+          <w:b w:val="0"/>
+        </w:rPr>
+      </w:r>
+    </w:p>
+    <w:p>
+      <w:pPr>
+        <w:spacing w:before="0" w:after="0" w:line="240" w:lineRule="auto"/>
+      </w:pPr>
+      <w:r>
+        <w:rPr>
+          <w:b w:val="0"/>
+        </w:rPr>
+        <w:t>[Intro]</w:t>
+      </w:r>
+    </w:p>
+    <w:p>
+      <w:pPr>
+        <w:spacing w:before="0" w:after="0" w:line="240" w:lineRule="auto"/>
+      </w:pPr>
+      <w:r>
+        <w:rPr>
+          <w:b w:val="0"/>
+        </w:rPr>
+        <w:t>|D / / /|G / / /|</w:t>
+      </w:r>
+    </w:p>
+    <w:p>
+      <w:pPr>
+        <w:spacing w:before="0" w:after="0" w:line="240" w:lineRule="auto"/>
+      </w:pPr>
+      <w:r>
+        <w:rPr>
+          <w:b w:val="0"/>
+        </w:rPr>
+        <w:t>|D / / /|G / / /|</w:t>
+      </w:r>
+    </w:p>
+    <w:p>
+      <w:pPr>
+        <w:spacing w:before="0" w:after="0" w:line="240" w:lineRule="auto"/>
+      </w:pPr>
+      <w:r>
+        <w:rPr>
+          <w:b w:val="0"/>
+        </w:rPr>
+      </w:r>
+    </w:p>
+    <w:p>
+      <w:pPr>
+        <w:spacing w:before="0" w:after="0" w:line="240" w:lineRule="auto"/>
+      </w:pPr>
+      <w:r>
+        <w:rPr>
+          <w:b w:val="0"/>
+        </w:rPr>
+        <w:t>[Bridge]</w:t>
+      </w:r>
+    </w:p>
+    <w:p>
+      <w:pPr>
+        <w:spacing w:before="0" w:after="0" w:line="240" w:lineRule="auto"/>
+      </w:pPr>
+      <w:r>
+        <w:rPr>
+          <w:b w:val="0"/>
+        </w:rPr>
+        <w:t>G                                              A</w:t>
+      </w:r>
+    </w:p>
+    <w:p>
+      <w:pPr>
+        <w:spacing w:before="0" w:after="0" w:line="240" w:lineRule="auto"/>
+      </w:pPr>
+      <w:r>
+        <w:rPr>
+          <w:b w:val="0"/>
+        </w:rPr>
+        <w:t>Neither height nor depth can separate us</w:t>
+      </w:r>
+    </w:p>
+    <w:p>
+      <w:pPr>
+        <w:spacing w:before="0" w:after="0" w:line="240" w:lineRule="auto"/>
+      </w:pPr>
+      <w:r>
+        <w:rPr>
+          <w:b w:val="0"/>
+        </w:rPr>
+        <w:t>Bm                         D/F#</w:t>
+      </w:r>
+    </w:p>
+    <w:p>
+      <w:pPr>
+        <w:spacing w:before="0" w:after="0" w:line="240" w:lineRule="auto"/>
+      </w:pPr>
+      <w:r>
+        <w:rPr>
+          <w:b w:val="0"/>
+        </w:rPr>
+        <w:t>Hell and death will not defeat us</w:t>
+      </w:r>
+    </w:p>
+    <w:p>
+      <w:pPr>
+        <w:spacing w:before="0" w:after="0" w:line="240" w:lineRule="auto"/>
+      </w:pPr>
+      <w:r>
+        <w:rPr>
+          <w:b w:val="0"/>
+        </w:rPr>
+        <w:t>G                         A</w:t>
+      </w:r>
+    </w:p>
+    <w:p>
+      <w:pPr>
+        <w:spacing w:before="0" w:after="0" w:line="240" w:lineRule="auto"/>
+      </w:pPr>
+      <w:r>
+        <w:rPr>
+          <w:b w:val="0"/>
+        </w:rPr>
+        <w:t>He who gave His son to free us</w:t>
+      </w:r>
+    </w:p>
+    <w:p>
+      <w:pPr>
+        <w:spacing w:before="0" w:after="0" w:line="240" w:lineRule="auto"/>
+      </w:pPr>
+      <w:r>
+        <w:rPr>
+          <w:b w:val="0"/>
+        </w:rPr>
+        <w:t>Bm                     A</w:t>
+      </w:r>
+    </w:p>
+    <w:p>
+      <w:pPr>
+        <w:spacing w:before="0" w:after="0" w:line="240" w:lineRule="auto"/>
+      </w:pPr>
+      <w:r>
+        <w:rPr>
+          <w:b w:val="0"/>
+        </w:rPr>
+        <w:t>Holds me in His love</w:t>
+      </w:r>
+    </w:p>
+    <w:p>
+      <w:pPr>
+        <w:spacing w:before="0" w:after="0" w:line="240" w:lineRule="auto"/>
+      </w:pPr>
+      <w:r>
+        <w:rPr>
+          <w:b w:val="0"/>
+        </w:rPr>
+        <w:t>G                                            A</w:t>
+      </w:r>
+    </w:p>
+    <w:p>
+      <w:pPr>
+        <w:spacing w:before="0" w:after="0" w:line="240" w:lineRule="auto"/>
+      </w:pPr>
+      <w:r>
+        <w:rPr>
+          <w:b w:val="0"/>
+        </w:rPr>
+        <w:t>Neither height nor depth can separate us</w:t>
+      </w:r>
+    </w:p>
+    <w:p>
+      <w:pPr>
+        <w:spacing w:before="0" w:after="0" w:line="240" w:lineRule="auto"/>
+      </w:pPr>
+      <w:r>
+        <w:rPr>
+          <w:b w:val="0"/>
+        </w:rPr>
+        <w:t>Bm                         D/F#</w:t>
+      </w:r>
+    </w:p>
+    <w:p>
+      <w:pPr>
+        <w:spacing w:before="0" w:after="0" w:line="240" w:lineRule="auto"/>
+      </w:pPr>
+      <w:r>
+        <w:rPr>
+          <w:b w:val="0"/>
+        </w:rPr>
+        <w:t>Hell and death will not defeat us</w:t>
+      </w:r>
+    </w:p>
+    <w:p>
+      <w:pPr>
+        <w:spacing w:before="0" w:after="0" w:line="240" w:lineRule="auto"/>
+      </w:pPr>
+      <w:r>
+        <w:rPr>
+          <w:b w:val="0"/>
+        </w:rPr>
+        <w:t>G                           A</w:t>
+      </w:r>
+    </w:p>
+    <w:p>
+      <w:pPr>
+        <w:spacing w:before="0" w:after="0" w:line="240" w:lineRule="auto"/>
+      </w:pPr>
+      <w:r>
+        <w:rPr>
+          <w:b w:val="0"/>
+        </w:rPr>
+        <w:t>He who gave His son to free us</w:t>
+      </w:r>
+    </w:p>
+    <w:p>
+      <w:pPr>
+        <w:spacing w:before="0" w:after="0" w:line="240" w:lineRule="auto"/>
+      </w:pPr>
+      <w:r>
+        <w:rPr>
+          <w:b w:val="0"/>
+        </w:rPr>
+        <w:t>Bm                     A</w:t>
+      </w:r>
+    </w:p>
+    <w:p>
+      <w:pPr>
+        <w:spacing w:before="0" w:after="0" w:line="240" w:lineRule="auto"/>
+      </w:pPr>
+      <w:r>
+        <w:rPr>
+          <w:b w:val="0"/>
+        </w:rPr>
+        <w:t>Holds me in His love</w:t>
+      </w:r>
+    </w:p>
+    <w:p>
+      <w:pPr>
+        <w:spacing w:before="0" w:after="0" w:line="240" w:lineRule="auto"/>
+      </w:pPr>
+      <w:r>
+        <w:rPr>
+          <w:b w:val="0"/>
+        </w:rPr>
+      </w:r>
+    </w:p>
+    <w:p>
+      <w:pPr>
+        <w:spacing w:before="0" w:after="0" w:line="240" w:lineRule="auto"/>
+      </w:pPr>
+      <w:r>
+        <w:rPr>
+          <w:b w:val="0"/>
+        </w:rPr>
+        <w:t>**CHORUS** x2</w:t>
+      </w:r>
+    </w:p>
+    <w:p>
+      <w:pPr>
+        <w:spacing w:before="0" w:after="0" w:line="240" w:lineRule="auto"/>
+      </w:pPr>
+      <w:r>
+        <w:rPr>
+          <w:b w:val="0"/>
+        </w:rPr>
+      </w:r>
+    </w:p>
+    <w:p>
+      <w:pPr>
+        <w:spacing w:before="0" w:after="0" w:line="240" w:lineRule="auto"/>
+      </w:pPr>
+      <w:r>
+        <w:rPr>
+          <w:b w:val="0"/>
+        </w:rPr>
+        <w:t>[Outro]</w:t>
+      </w:r>
+    </w:p>
+    <w:p>
+      <w:pPr>
+        <w:spacing w:before="0" w:after="0" w:line="240" w:lineRule="auto"/>
+      </w:pPr>
+      <w:r>
+        <w:rPr>
+          <w:b w:val="0"/>
+        </w:rPr>
+        <w:t>|D / / /|G / / /|</w:t>
+      </w:r>
+    </w:p>
+    <w:p>
+      <w:pPr>
+        <w:spacing w:before="0" w:after="0" w:line="240" w:lineRule="auto"/>
+      </w:pPr>
+      <w:r>
+        <w:rPr>
+          <w:b w:val="0"/>
+        </w:rPr>
+        <w:t>|D / / /|G / / /|</w:t>
+      </w:r>
+    </w:p>
+    <w:p>
+      <w:pPr>
+        <w:spacing w:before="0" w:after="0" w:line="240" w:lineRule="auto"/>
+      </w:pPr>
+      <w:r>
+        <w:rPr>
+          <w:b w:val="0"/>
+        </w:rPr>
+      </w:r>
+    </w:p>
+    <w:p>
+      <w:pPr>
+        <w:spacing w:before="0" w:after="0" w:line="240" w:lineRule="auto"/>
+      </w:pPr>
+      <w:r>
+        <w:rPr>
+          <w:b w:val="0"/>
+        </w:rPr>
+        <w:t>[End]</w:t>
+      </w:r>
+    </w:p>
+    <w:p>
+      <w:pPr>
+        <w:spacing w:before="0" w:after="0" w:line="240" w:lineRule="auto"/>
+      </w:pPr>
+      <w:r>
+        <w:rPr>
+          <w:b w:val="0"/>
+        </w:rPr>
+        <w:t>D</w:t>
+      </w:r>
+    </w:p>
+    <w:p>
+      <w:pPr>
+        <w:spacing w:before="0" w:after="0" w:line="240" w:lineRule="auto"/>
+      </w:pPr>
+      <w:r>
+        <w:rPr>
+          <w:b w:val="0"/>
+        </w:rPr>
+      </w:r>
+    </w:p>
+    <w:p>
+      <w:pPr>
+        <w:spacing w:before="0" w:after="0" w:line="240" w:lineRule="auto"/>
+      </w:pPr>
+      <w:r>
+        <w:rPr>
+          <w:b/>
+        </w:rPr>
         <w:t>MY GOD IS A VERY VERY VERY BIG GOD (C)</w:t>
       </w:r>
     </w:p>
@@ -1326,7 +2085,7 @@
         <w:rPr>
           <w:b/>
         </w:rPr>
-        <w:t>Sovereign (D)</w:t>
+        <w:t>Sovereign (E)</w:t>
       </w:r>
     </w:p>
     <w:p>
@@ -1348,7 +2107,7 @@
         <w:rPr>
           <w:b w:val="0"/>
         </w:rPr>
-        <w:t>D Bm G Bm A</w:t>
+        <w:t>E C#m A C#m B</w:t>
       </w:r>
     </w:p>
     <w:p>
@@ -1380,7 +2139,7 @@
         <w:rPr>
           <w:b w:val="0"/>
         </w:rPr>
-        <w:t>D</w:t>
+        <w:t>E</w:t>
       </w:r>
     </w:p>
     <w:p>
@@ -1402,7 +2161,7 @@
         <w:rPr>
           <w:b w:val="0"/>
         </w:rPr>
-        <w:t>Bm</w:t>
+        <w:t>C#m</w:t>
       </w:r>
     </w:p>
     <w:p>
@@ -1424,7 +2183,7 @@
         <w:rPr>
           <w:b w:val="0"/>
         </w:rPr>
-        <w:t>G</w:t>
+        <w:t>A</w:t>
       </w:r>
     </w:p>
     <w:p>
@@ -1446,7 +2205,7 @@
         <w:rPr>
           <w:b w:val="0"/>
         </w:rPr>
-        <w:t>Bm                    A</w:t>
+        <w:t>C#m                   B</w:t>
       </w:r>
     </w:p>
     <w:p>
@@ -1468,7 +2227,7 @@
         <w:rPr>
           <w:b w:val="0"/>
         </w:rPr>
-        <w:t>D</w:t>
+        <w:t>E</w:t>
       </w:r>
     </w:p>
     <w:p>
@@ -1490,7 +2249,7 @@
         <w:rPr>
           <w:b w:val="0"/>
         </w:rPr>
-        <w:t>Bm</w:t>
+        <w:t>C#m</w:t>
       </w:r>
     </w:p>
     <w:p>
@@ -1512,7 +2271,7 @@
         <w:rPr>
           <w:b w:val="0"/>
         </w:rPr>
-        <w:t>G</w:t>
+        <w:t>A</w:t>
       </w:r>
     </w:p>
     <w:p>
@@ -1534,7 +2293,7 @@
         <w:rPr>
           <w:b w:val="0"/>
         </w:rPr>
-        <w:t>Bm                    A</w:t>
+        <w:t>C#m                   B</w:t>
       </w:r>
     </w:p>
     <w:p>
@@ -1577,7 +2336,7 @@
         <w:rPr>
           <w:b w:val="0"/>
         </w:rPr>
-        <w:t>D                              Bm</w:t>
+        <w:t>E                              C#m</w:t>
       </w:r>
     </w:p>
     <w:p>
@@ -1599,7 +2358,7 @@
         <w:rPr>
           <w:b w:val="0"/>
         </w:rPr>
-        <w:t xml:space="preserve">                                 G</w:t>
+        <w:t xml:space="preserve">                                 A</w:t>
       </w:r>
     </w:p>
     <w:p>
@@ -1621,7 +2380,7 @@
         <w:rPr>
           <w:b w:val="0"/>
         </w:rPr>
-        <w:t xml:space="preserve">                                    Bm</w:t>
+        <w:t xml:space="preserve">                                    C#m</w:t>
       </w:r>
     </w:p>
     <w:p>
@@ -1643,7 +2402,7 @@
         <w:rPr>
           <w:b w:val="0"/>
         </w:rPr>
-        <w:t xml:space="preserve">         A</w:t>
+        <w:t xml:space="preserve">         B</w:t>
       </w:r>
     </w:p>
     <w:p>
@@ -1665,7 +2424,7 @@
         <w:rPr>
           <w:b w:val="0"/>
         </w:rPr>
-        <w:t>D                                 Bm</w:t>
+        <w:t>E                                 C#m</w:t>
       </w:r>
     </w:p>
     <w:p>
@@ -1687,7 +2446,7 @@
         <w:rPr>
           <w:b w:val="0"/>
         </w:rPr>
-        <w:t xml:space="preserve">                                       G</w:t>
+        <w:t xml:space="preserve">                                       A</w:t>
       </w:r>
     </w:p>
     <w:p>
@@ -1709,7 +2468,7 @@
         <w:rPr>
           <w:b w:val="0"/>
         </w:rPr>
-        <w:t xml:space="preserve">                                         Bm</w:t>
+        <w:t xml:space="preserve">                                         C#m</w:t>
       </w:r>
     </w:p>
     <w:p>
@@ -1731,7 +2490,7 @@
         <w:rPr>
           <w:b w:val="0"/>
         </w:rPr>
-        <w:t xml:space="preserve">        A</w:t>
+        <w:t xml:space="preserve">        B</w:t>
       </w:r>
     </w:p>
     <w:p>
@@ -1805,7 +2564,7 @@
         <w:rPr>
           <w:b w:val="0"/>
         </w:rPr>
-        <w:t xml:space="preserve">                                         Bm</w:t>
+        <w:t xml:space="preserve">                                         C#m</w:t>
       </w:r>
     </w:p>
     <w:p>
@@ -1827,7 +2586,7 @@
         <w:rPr>
           <w:b w:val="0"/>
         </w:rPr>
-        <w:t xml:space="preserve">        A          D</w:t>
+        <w:t xml:space="preserve">        B          E</w:t>
       </w:r>
     </w:p>
     <w:p>
@@ -1870,7 +2629,7 @@
         <w:rPr>
           <w:b w:val="0"/>
         </w:rPr>
-        <w:t>D            G                Bm</w:t>
+        <w:t>E            A                C#m</w:t>
       </w:r>
     </w:p>
     <w:p>
@@ -1892,7 +2651,7 @@
         <w:rPr>
           <w:b w:val="0"/>
         </w:rPr>
-        <w:t xml:space="preserve">         A</w:t>
+        <w:t xml:space="preserve">         B</w:t>
       </w:r>
     </w:p>
     <w:p>
@@ -1914,7 +2673,7 @@
         <w:rPr>
           <w:b w:val="0"/>
         </w:rPr>
-        <w:t>D           G             Bm</w:t>
+        <w:t>E           A             C#m</w:t>
       </w:r>
     </w:p>
     <w:p>
@@ -1936,7 +2695,7 @@
         <w:rPr>
           <w:b w:val="0"/>
         </w:rPr>
-        <w:t xml:space="preserve">         A</w:t>
+        <w:t xml:space="preserve">         B</w:t>
       </w:r>
     </w:p>
     <w:p>
@@ -1958,7 +2717,7 @@
         <w:rPr>
           <w:b w:val="0"/>
         </w:rPr>
-        <w:t>D            G                  Bm</w:t>
+        <w:t>E            A                  C#m</w:t>
       </w:r>
     </w:p>
     <w:p>
@@ -1980,7 +2739,7 @@
         <w:rPr>
           <w:b w:val="0"/>
         </w:rPr>
-        <w:t xml:space="preserve">        A           D G Bm A</w:t>
+        <w:t xml:space="preserve">        B           E A C#m B</w:t>
       </w:r>
     </w:p>
     <w:p>

</xml_diff>